<commit_message>
Suppression du tableaux des codes sources
</commit_message>
<xml_diff>
--- a/assets/Ann1/Planing.docx
+++ b/assets/Ann1/Planing.docx
@@ -7,11 +7,14 @@
         <w:jc w:val="center"/>
       </w:pPr>
       <w:r>
+        <w:rPr>
+          <w:noProof/>
+        </w:rPr>
         <w:drawing>
-          <wp:inline distT="0" distB="0" distL="0" distR="0" wp14:anchorId="654C7DD3" wp14:editId="46454F2B">
-            <wp:extent cx="10520118" cy="7512908"/>
-            <wp:effectExtent l="0" t="0" r="0" b="5715"/>
-            <wp:docPr id="812157882" name="Image 1"/>
+          <wp:inline distT="0" distB="0" distL="0" distR="0" wp14:anchorId="5362F9E5" wp14:editId="382EC4BB">
+            <wp:extent cx="10651409" cy="7540906"/>
+            <wp:effectExtent l="0" t="0" r="4445" b="3175"/>
+            <wp:docPr id="398189924" name="Image 1"/>
             <wp:cNvGraphicFramePr>
               <a:graphicFrameLocks xmlns:a="http://schemas.openxmlformats.org/drawingml/2006/main" noChangeAspect="1"/>
             </wp:cNvGraphicFramePr>
@@ -19,12 +22,12 @@
               <a:graphicData uri="http://schemas.openxmlformats.org/drawingml/2006/picture">
                 <pic:pic xmlns:pic="http://schemas.openxmlformats.org/drawingml/2006/picture">
                   <pic:nvPicPr>
-                    <pic:cNvPr id="812157882" name=""/>
+                    <pic:cNvPr id="1209147029" name=""/>
                     <pic:cNvPicPr/>
                   </pic:nvPicPr>
                   <pic:blipFill rotWithShape="1">
                     <a:blip r:embed="rId4"/>
-                    <a:srcRect b="65953"/>
+                    <a:srcRect t="182" b="66994"/>
                     <a:stretch>
                       <a:fillRect/>
                     </a:stretch>
@@ -32,7 +35,7 @@
                   <pic:spPr bwMode="auto">
                     <a:xfrm>
                       <a:off x="0" y="0"/>
-                      <a:ext cx="10660655" cy="7613272"/>
+                      <a:ext cx="10839309" cy="7673934"/>
                     </a:xfrm>
                     <a:prstGeom prst="rect">
                       <a:avLst/>
@@ -56,12 +59,15 @@
         <w:br/>
       </w:r>
       <w:r>
+        <w:rPr>
+          <w:noProof/>
+        </w:rPr>
         <w:lastRenderedPageBreak/>
         <w:drawing>
-          <wp:inline distT="0" distB="0" distL="0" distR="0" wp14:anchorId="192C63D0" wp14:editId="4CC0C394">
-            <wp:extent cx="10564371" cy="7415684"/>
-            <wp:effectExtent l="0" t="0" r="2540" b="1270"/>
-            <wp:docPr id="1089957437" name="Image 1"/>
+          <wp:inline distT="0" distB="0" distL="0" distR="0" wp14:anchorId="6E33BE65" wp14:editId="096B3B85">
+            <wp:extent cx="10618871" cy="7535537"/>
+            <wp:effectExtent l="0" t="0" r="0" b="0"/>
+            <wp:docPr id="1209147029" name="Image 1"/>
             <wp:cNvGraphicFramePr>
               <a:graphicFrameLocks xmlns:a="http://schemas.openxmlformats.org/drawingml/2006/main" noChangeAspect="1"/>
             </wp:cNvGraphicFramePr>
@@ -69,12 +75,12 @@
               <a:graphicData uri="http://schemas.openxmlformats.org/drawingml/2006/picture">
                 <pic:pic xmlns:pic="http://schemas.openxmlformats.org/drawingml/2006/picture">
                   <pic:nvPicPr>
-                    <pic:cNvPr id="812157882" name=""/>
+                    <pic:cNvPr id="1209147029" name=""/>
                     <pic:cNvPicPr/>
                   </pic:nvPicPr>
                   <pic:blipFill rotWithShape="1">
                     <a:blip r:embed="rId4"/>
-                    <a:srcRect t="34003" b="32532"/>
+                    <a:srcRect t="33009" b="34091"/>
                     <a:stretch>
                       <a:fillRect/>
                     </a:stretch>
@@ -82,7 +88,7 @@
                   <pic:spPr bwMode="auto">
                     <a:xfrm>
                       <a:off x="0" y="0"/>
-                      <a:ext cx="10683321" cy="7499181"/>
+                      <a:ext cx="10684841" cy="7582352"/>
                     </a:xfrm>
                     <a:prstGeom prst="rect">
                       <a:avLst/>
@@ -102,16 +108,21 @@
           </wp:inline>
         </w:drawing>
       </w:r>
+    </w:p>
+    <w:p>
+      <w:pPr>
+        <w:jc w:val="center"/>
+      </w:pPr>
       <w:r>
-        <w:br/>
-      </w:r>
-      <w:r>
+        <w:rPr>
+          <w:noProof/>
+        </w:rPr>
         <w:lastRenderedPageBreak/>
         <w:drawing>
-          <wp:inline distT="0" distB="0" distL="0" distR="0" wp14:anchorId="719EDC32" wp14:editId="46CF8B10">
-            <wp:extent cx="10503015" cy="7154779"/>
-            <wp:effectExtent l="0" t="0" r="0" b="0"/>
-            <wp:docPr id="1901466239" name="Image 1"/>
+          <wp:inline distT="0" distB="0" distL="0" distR="0" wp14:anchorId="458C525F" wp14:editId="264774CE">
+            <wp:extent cx="10167020" cy="7479587"/>
+            <wp:effectExtent l="0" t="0" r="0" b="1270"/>
+            <wp:docPr id="932270462" name="Image 1"/>
             <wp:cNvGraphicFramePr>
               <a:graphicFrameLocks xmlns:a="http://schemas.openxmlformats.org/drawingml/2006/main" noChangeAspect="1"/>
             </wp:cNvGraphicFramePr>
@@ -119,12 +130,12 @@
               <a:graphicData uri="http://schemas.openxmlformats.org/drawingml/2006/picture">
                 <pic:pic xmlns:pic="http://schemas.openxmlformats.org/drawingml/2006/picture">
                   <pic:nvPicPr>
-                    <pic:cNvPr id="812157882" name=""/>
+                    <pic:cNvPr id="1209147029" name=""/>
                     <pic:cNvPicPr/>
                   </pic:nvPicPr>
                   <pic:blipFill rotWithShape="1">
                     <a:blip r:embed="rId4"/>
-                    <a:srcRect t="67524"/>
+                    <a:srcRect t="65891" b="1"/>
                     <a:stretch>
                       <a:fillRect/>
                     </a:stretch>
@@ -132,7 +143,7 @@
                   <pic:spPr bwMode="auto">
                     <a:xfrm>
                       <a:off x="0" y="0"/>
-                      <a:ext cx="10613705" cy="7230182"/>
+                      <a:ext cx="10246472" cy="7538037"/>
                     </a:xfrm>
                     <a:prstGeom prst="rect">
                       <a:avLst/>
@@ -151,9 +162,6 @@
             </a:graphic>
           </wp:inline>
         </w:drawing>
-      </w:r>
-      <w:r>
-        <w:br/>
       </w:r>
     </w:p>
     <w:sectPr>

</xml_diff>